<commit_message>
paper: strengthen literature framing and release metadata
</commit_message>
<xml_diff>
--- a/provenance_sdm/manuscript/Ecological_Modelling_cover_letter.docx
+++ b/provenance_sdm/manuscript/Ecological_Modelling_cover_letter.docx
@@ -8,7 +8,7 @@
         <w:jc w:val="left"/>
       </w:pPr>
       <w:r>
-        <w:t>11 August 2026</w:t>
+        <w:t>29 August 2026</w:t>
       </w:r>
     </w:p>
     <w:p>
@@ -101,7 +101,7 @@
         <w:jc w:val="left"/>
       </w:pPr>
       <w:r>
-        <w:t>This manuscript is original, is not under consideration elsewhere, and has one author. No competing interests exist. The GBIF archive has a persistent DOI, and the code, configuration, audit manifests, figures, and tables are available on a dedicated public repository branch. A versioned archival release will be created before final submission.</w:t>
+        <w:t>This manuscript is original, is not under consideration elsewhere, and has one author. No competing interests exist. The GBIF archive has a persistent DOI, and the code, configuration, audit manifests, figures, and tables are available on a dedicated public repository branch and in a versioned Zenodo archive at https://doi.org/10.5281/zenodo.22164506.</w:t>
       </w:r>
     </w:p>
     <w:p>
@@ -137,7 +137,7 @@
         <w:jc w:val="left"/>
       </w:pPr>
       <w:r>
-        <w:t>Independent researcher, United Kingdom</w:t>
+        <w:t>Independent researcher, Birmingham, B1 1BA, United Kingdom</w:t>
       </w:r>
     </w:p>
     <w:p>

</xml_diff>